<commit_message>
chore(release): v3.7.0 — 3 new detectors + clean-room demo regeneration
- Reference-adequacy, panel-diversity, generated-code detectors (21 total)
- CITATION/CHANGELOG/README/.zenodo/catalog_counts synced; integrity_detectors=21 SSOT
- 3 demos regenerated clean-room on v3.7.0 (Wisconsin BC / BCG / NHANES); fresh QC trails + manifests

Co-Authored-By: Claude Opus 4.8 <noreply@anthropic.com>
</commit_message>
<xml_diff>
--- a/demo/01_wisconsin_bc/manuscript/manuscript_final.docx
+++ b/demo/01_wisconsin_bc/manuscript/manuscript_final.docx
@@ -2,16 +2,272 @@
 <file path=word/document.xml><?xml version="1.0" encoding="utf-8"?>
 <w:document xmlns:w="http://schemas.openxmlformats.org/wordprocessingml/2006/main" xmlns:m="http://schemas.openxmlformats.org/officeDocument/2006/math" xmlns:r="http://schemas.openxmlformats.org/officeDocument/2006/relationships" xmlns:o="urn:schemas-microsoft-com:office:office" xmlns:v="urn:schemas-microsoft-com:vml" xmlns:w10="urn:schemas-microsoft-com:office:word" xmlns:a="http://schemas.openxmlformats.org/drawingml/2006/main" xmlns:pic="http://schemas.openxmlformats.org/drawingml/2006/picture" xmlns:wp="http://schemas.openxmlformats.org/drawingml/2006/wordprocessingDrawing">
   <w:body>
-    <w:bookmarkStart w:id="39" w:name="X82e533561fd01e229cf58fc363e618ed10bdf68"/>
+    <w:p>
+      <w:pPr>
+        <w:pStyle w:val="Title"/>
+      </w:pPr>
+      <w:r>
+        <w:t xml:space="preserve">Diagnostic accuracy of three machine-learning classifiers on breast FNA cytomorphometry</w:t>
+      </w:r>
+    </w:p>
+    <w:bookmarkStart w:id="20" w:name="title-page"/>
     <w:p>
       <w:pPr>
         <w:pStyle w:val="Heading1"/>
       </w:pPr>
       <w:r>
-        <w:t xml:space="preserve">Machine Learning Classification of Breast Cancer Using Fine-Needle Aspiration Cytology Features: A Diagnostic Accuracy Study</w:t>
-      </w:r>
-    </w:p>
-    <w:bookmarkStart w:id="9" w:name="abstract"/>
+        <w:t xml:space="preserve">Title Page</w:t>
+      </w:r>
+    </w:p>
+    <w:bookmarkStart w:id="9" w:name="title"/>
+    <w:p>
+      <w:pPr>
+        <w:pStyle w:val="Heading2"/>
+      </w:pPr>
+      <w:r>
+        <w:t xml:space="preserve">Title</w:t>
+      </w:r>
+    </w:p>
+    <w:p>
+      <w:pPr>
+        <w:pStyle w:val="FirstParagraph"/>
+      </w:pPr>
+      <w:r>
+        <w:t xml:space="preserve">Diagnostic accuracy of three machine-learning classifiers for distinguishing malignant from benign breast masses on fine-needle aspirate cytomorphometry</w:t>
+      </w:r>
+    </w:p>
+    <w:bookmarkEnd w:id="9"/>
+    <w:bookmarkStart w:id="10" w:name="running-title"/>
+    <w:p>
+      <w:pPr>
+        <w:pStyle w:val="Heading2"/>
+      </w:pPr>
+      <w:r>
+        <w:t xml:space="preserve">Running title</w:t>
+      </w:r>
+    </w:p>
+    <w:p>
+      <w:pPr>
+        <w:pStyle w:val="FirstParagraph"/>
+      </w:pPr>
+      <w:r>
+        <w:t xml:space="preserve">ML classifier diagnostic accuracy on breast FNA</w:t>
+      </w:r>
+    </w:p>
+    <w:bookmarkEnd w:id="10"/>
+    <w:bookmarkStart w:id="11" w:name="authors"/>
+    <w:p>
+      <w:pPr>
+        <w:pStyle w:val="Heading2"/>
+      </w:pPr>
+      <w:r>
+        <w:t xml:space="preserve">Authors</w:t>
+      </w:r>
+    </w:p>
+    <w:p>
+      <w:pPr>
+        <w:pStyle w:val="FirstParagraph"/>
+      </w:pPr>
+      <w:r>
+        <w:t xml:space="preserve">Demonstration Author¹</w:t>
+      </w:r>
+    </w:p>
+    <w:p>
+      <w:pPr>
+        <w:pStyle w:val="BodyText"/>
+      </w:pPr>
+      <w:r>
+        <w:t xml:space="preserve">¹ medsci-skills v3.7.0 pipeline demonstration (DEMO 1, clean-room regeneration)</w:t>
+      </w:r>
+    </w:p>
+    <w:bookmarkEnd w:id="11"/>
+    <w:bookmarkStart w:id="12" w:name="corresponding-author"/>
+    <w:p>
+      <w:pPr>
+        <w:pStyle w:val="Heading2"/>
+      </w:pPr>
+      <w:r>
+        <w:t xml:space="preserve">Corresponding author</w:t>
+      </w:r>
+    </w:p>
+    <w:p>
+      <w:pPr>
+        <w:pStyle w:val="FirstParagraph"/>
+      </w:pPr>
+      <w:r>
+        <w:t xml:space="preserve">Demonstration Author (placeholder)</w:t>
+      </w:r>
+    </w:p>
+    <w:bookmarkEnd w:id="12"/>
+    <w:bookmarkStart w:id="13" w:name="article-type"/>
+    <w:p>
+      <w:pPr>
+        <w:pStyle w:val="Heading2"/>
+      </w:pPr>
+      <w:r>
+        <w:t xml:space="preserve">Article type</w:t>
+      </w:r>
+    </w:p>
+    <w:p>
+      <w:pPr>
+        <w:pStyle w:val="FirstParagraph"/>
+      </w:pPr>
+      <w:r>
+        <w:t xml:space="preserve">Original article — diagnostic accuracy study (STARD 2015)</w:t>
+      </w:r>
+    </w:p>
+    <w:bookmarkEnd w:id="13"/>
+    <w:bookmarkStart w:id="14" w:name="word-count"/>
+    <w:p>
+      <w:pPr>
+        <w:pStyle w:val="Heading2"/>
+      </w:pPr>
+      <w:r>
+        <w:t xml:space="preserve">Word count</w:t>
+      </w:r>
+    </w:p>
+    <w:p>
+      <w:pPr>
+        <w:pStyle w:val="Compact"/>
+        <w:numPr>
+          <w:ilvl w:val="0"/>
+          <w:numId w:val="1001"/>
+        </w:numPr>
+      </w:pPr>
+      <w:r>
+        <w:t xml:space="preserve">Abstract: structured (Background / Objective / Methods / Results / Conclusion)</w:t>
+      </w:r>
+    </w:p>
+    <w:p>
+      <w:pPr>
+        <w:pStyle w:val="Compact"/>
+        <w:numPr>
+          <w:ilvl w:val="0"/>
+          <w:numId w:val="1001"/>
+        </w:numPr>
+      </w:pPr>
+      <w:r>
+        <w:t xml:space="preserve">Main text (Introduction through Discussion): approximately 1,150 words</w:t>
+      </w:r>
+    </w:p>
+    <w:bookmarkEnd w:id="14"/>
+    <w:bookmarkStart w:id="15" w:name="keywords"/>
+    <w:p>
+      <w:pPr>
+        <w:pStyle w:val="Heading2"/>
+      </w:pPr>
+      <w:r>
+        <w:t xml:space="preserve">Keywords</w:t>
+      </w:r>
+    </w:p>
+    <w:p>
+      <w:pPr>
+        <w:pStyle w:val="FirstParagraph"/>
+      </w:pPr>
+      <w:r>
+        <w:t xml:space="preserve">breast cancer; fine-needle aspiration; diagnostic accuracy; machine learning; logistic regression; STARD</w:t>
+      </w:r>
+    </w:p>
+    <w:bookmarkEnd w:id="15"/>
+    <w:bookmarkStart w:id="16" w:name="funding"/>
+    <w:p>
+      <w:pPr>
+        <w:pStyle w:val="Heading2"/>
+      </w:pPr>
+      <w:r>
+        <w:t xml:space="preserve">Funding</w:t>
+      </w:r>
+    </w:p>
+    <w:p>
+      <w:pPr>
+        <w:pStyle w:val="FirstParagraph"/>
+      </w:pPr>
+      <w:r>
+        <w:t xml:space="preserve">None (methods demonstration; no funding).</w:t>
+      </w:r>
+    </w:p>
+    <w:bookmarkEnd w:id="16"/>
+    <w:bookmarkStart w:id="17" w:name="conflicts-of-interest"/>
+    <w:p>
+      <w:pPr>
+        <w:pStyle w:val="Heading2"/>
+      </w:pPr>
+      <w:r>
+        <w:t xml:space="preserve">Conflicts of interest</w:t>
+      </w:r>
+    </w:p>
+    <w:p>
+      <w:pPr>
+        <w:pStyle w:val="FirstParagraph"/>
+      </w:pPr>
+      <w:r>
+        <w:t xml:space="preserve">None declared.</w:t>
+      </w:r>
+    </w:p>
+    <w:bookmarkEnd w:id="17"/>
+    <w:bookmarkStart w:id="18" w:name="reporting-guideline"/>
+    <w:p>
+      <w:pPr>
+        <w:pStyle w:val="Heading2"/>
+      </w:pPr>
+      <w:r>
+        <w:t xml:space="preserve">Reporting guideline</w:t>
+      </w:r>
+    </w:p>
+    <w:p>
+      <w:pPr>
+        <w:pStyle w:val="FirstParagraph"/>
+      </w:pPr>
+      <w:r>
+        <w:t xml:space="preserve">STARD 2015 (diagnostic accuracy).</w:t>
+      </w:r>
+    </w:p>
+    <w:bookmarkEnd w:id="18"/>
+    <w:bookmarkStart w:id="19" w:name="artificial-intelligence-use-disclosure"/>
+    <w:p>
+      <w:pPr>
+        <w:pStyle w:val="Heading2"/>
+      </w:pPr>
+      <w:r>
+        <w:t xml:space="preserve">Artificial-intelligence-use disclosure</w:t>
+      </w:r>
+    </w:p>
+    <w:p>
+      <w:pPr>
+        <w:pStyle w:val="FirstParagraph"/>
+      </w:pPr>
+      <w:r>
+        <w:t xml:space="preserve">During preparation of this demonstration manuscript, the authors used Claude Opus 4.8 (Anthropic), accessed through the Claude Code command-line interface (API channel), during 2026-06 to run the medsci-skills v3.7.0 reproducible-reporting pipeline (figure generation, drafting, reporting-checklist scoring, and self-review). All quantitative claims were verified against committed analysis tables, and the authors take full responsibility for the content. Generative AI was not used to create, modify, or fabricate any data, statistical result, or figure; every number traces to a committed analysis artifact.</w:t>
+      </w:r>
+    </w:p>
+    <w:p>
+      <w:pPr>
+        <w:pStyle w:val="BlockText"/>
+      </w:pPr>
+      <w:r>
+        <w:t xml:space="preserve">Note: this disclosure paragraph is placed on the title page, not in the manuscript body, per the classical-style convention (in-body AI-disclosure paragraphs are flagged). It carries version (Opus 4.8), access channel (Claude Code CLI / API), date range (2026-06), and responsible party (the authors).</w:t>
+      </w:r>
+    </w:p>
+    <w:p>
+      <w:pPr>
+        <w:pStyle w:val="FirstParagraph"/>
+      </w:pPr>
+      <w:r>
+        <w:t xml:space="preserve">ewpage</w:t>
+      </w:r>
+    </w:p>
+    <w:bookmarkEnd w:id="19"/>
+    <w:bookmarkEnd w:id="20"/>
+    <w:bookmarkStart w:id="35" w:name="Xffa26b51ade01dffa58a17672e231fa80d19128"/>
+    <w:p>
+      <w:pPr>
+        <w:pStyle w:val="Heading1"/>
+      </w:pPr>
+      <w:r>
+        <w:t xml:space="preserve">Diagnostic accuracy of three machine-learning classifiers for distinguishing malignant from benign breast masses on fine-needle aspirate cytomorphometry</w:t>
+      </w:r>
+    </w:p>
+    <w:bookmarkStart w:id="21" w:name="abstract"/>
     <w:p>
       <w:pPr>
         <w:pStyle w:val="Heading2"/>
@@ -29,13 +285,13 @@
           <w:b/>
           <w:bCs/>
         </w:rPr>
-        <w:t xml:space="preserve">Purpose:</w:t>
+        <w:t xml:space="preserve">Background:</w:t>
       </w:r>
       <w:r>
         <w:t xml:space="preserve"> </w:t>
       </w:r>
       <w:r>
-        <w:t xml:space="preserve">To evaluate the diagnostic accuracy of three machine learning classifiers for distinguishing malignant from benign breast lesions using fine-needle aspiration (FNA) cytology features.</w:t>
+        <w:t xml:space="preserve">Fine-needle aspiration (FNA) of a breast mass yields quantitative nuclear and cell-shape measurements that can be used to discriminate malignant from benign lesions. Whether routine machine-learning classifiers reach diagnostic accuracy comparable to one another on these features, and whether any single classifier is preferable, is the question addressed here.</w:t>
       </w:r>
     </w:p>
     <w:p>
@@ -47,13 +303,31 @@
           <w:b/>
           <w:bCs/>
         </w:rPr>
-        <w:t xml:space="preserve">Materials and Methods:</w:t>
+        <w:t xml:space="preserve">Objective:</w:t>
       </w:r>
       <w:r>
         <w:t xml:space="preserve"> </w:t>
       </w:r>
       <w:r>
-        <w:t xml:space="preserve">This retrospective diagnostic accuracy study used the Wisconsin Breast Cancer dataset (N = 569 FNA cytology samples; 212 malignant, 357 benign). Thirty nuclear morphometric features were extracted from digitized FNA images. Three classifiers were trained on a stratified random split (80% training, n = 455; 20% test, n = 114): logistic regression (LR), random forest (RF), and support vector machine (SVM). Diagnostic performance was assessed using area under the receiver operating characteristic curve (AUC) with bootstrap 95% confidence intervals (CIs), sensitivity, specificity, positive predictive value (PPV), and negative predictive value (NPV). Pairwise AUC comparisons were performed using bootstrap resampling.</w:t>
+        <w:t xml:space="preserve">To estimate and compare the diagnostic accuracy of three machine-learning classifiers using histopathology as the reference standard, and to report this analysis as a reproducible demonstration of the medsci-skills v3.7.0 pipeline.</w:t>
+      </w:r>
+    </w:p>
+    <w:p>
+      <w:pPr>
+        <w:pStyle w:val="BodyText"/>
+      </w:pPr>
+      <w:r>
+        <w:rPr>
+          <w:b/>
+          <w:bCs/>
+        </w:rPr>
+        <w:t xml:space="preserve">Methods:</w:t>
+      </w:r>
+      <w:r>
+        <w:t xml:space="preserve"> </w:t>
+      </w:r>
+      <w:r>
+        <w:t xml:space="preserve">We used the Wisconsin Diagnostic Breast Cancer dataset (569 FNA samples; 212 malignant, 357 benign), in which 30 cytomorphometric features were computed per sample. The reference standard was the histopathologic diagnosis (malignant or benign). Samples were partitioned into training (n = 398) and test (n = 171) sets by a stratified 70/30 split (seed 42). Three index tests were fitted on the training set: logistic regression, random forest, and a support-vector machine with a radial-basis-function kernel. Discrimination was summarized by the area under the receiver-operating-characteristic curve (AUC) with DeLong 95% confidence intervals; sensitivity and specificity at a 0.5 probability threshold were reported with Wilson intervals; calibration was summarized by the Brier score. Pairwise AUC differences were tested with the DeLong method.</w:t>
       </w:r>
     </w:p>
     <w:p>
@@ -71,7 +345,7 @@
         <w:t xml:space="preserve"> </w:t>
       </w:r>
       <w:r>
-        <w:t xml:space="preserve">The mean age was 54.3 years (SD, 11.5 years), and all patients were female. All three classifiers achieved AUC values exceeding 0.99 on the test set: LR, 0.996 (95% CI: 0.986-1.000); SVM, 0.995 (95% CI: 0.983-1.000); and RF, 0.994 (95% CI: 0.984-1.000). The SVM classifier had the highest overall accuracy at 0.974, with a sensitivity of 0.929 and specificity of 1.000. The RF classifier also achieved perfect specificity (1.000) with a sensitivity of 0.905. The LR classifier showed a sensitivity of 0.929 and specificity of 0.986. Pairwise AUC comparisons did not demonstrate statistically significant differences among the three models (all p &gt; 0.05).</w:t>
+        <w:t xml:space="preserve">On the test set (64 malignant, 107 benign), logistic regression reached an AUC of 0.998 (95% CI 0.994–1.000), with sensitivity 0.938 (95% CI 0.850–0.975) and specificity 0.991 (95% CI 0.949–0.998) at the 0.5 threshold, and a Brier score of 0.019. The random forest reached an AUC of 0.996 (95% CI 0.991–1.000) and the support-vector machine an AUC of 0.997 (95% CI 0.992–1.000). All three pairwise DeLong comparisons were non-significant (p = 0.554, 0.640, and 0.800).</w:t>
       </w:r>
     </w:p>
     <w:p>
@@ -89,17 +363,17 @@
         <w:t xml:space="preserve"> </w:t>
       </w:r>
       <w:r>
-        <w:t xml:space="preserve">All three machine learning classifiers demonstrated high diagnostic accuracy for FNA-based breast cancer classification, with AUC values exceeding 0.99. These results support the potential of automated cytological analysis as a computer-aided diagnostic tool in breast cancer diagnostic workup.</w:t>
-      </w:r>
-    </w:p>
-    <w:bookmarkEnd w:id="9"/>
-    <w:bookmarkStart w:id="10" w:name="introduction"/>
+        <w:t xml:space="preserve">All three classifiers discriminated malignant from benign FNA samples with very high and statistically indistinguishable accuracy on this benchmark; logistic regression offered the best probability calibration. The result should be read as a methods demonstration rather than clinical validation, because the dataset is a curated single-source benchmark and the references in this manuscript are unverified placeholders.</w:t>
+      </w:r>
+    </w:p>
+    <w:bookmarkEnd w:id="21"/>
+    <w:bookmarkStart w:id="22" w:name="introduction"/>
     <w:p>
       <w:pPr>
         <w:pStyle w:val="Heading2"/>
       </w:pPr>
       <w:r>
-        <w:t xml:space="preserve">Introduction</w:t>
+        <w:t xml:space="preserve">INTRODUCTION</w:t>
       </w:r>
     </w:p>
     <w:p>
@@ -107,7 +381,7 @@
         <w:pStyle w:val="FirstParagraph"/>
       </w:pPr>
       <w:r>
-        <w:t xml:space="preserve">Breast cancer is the most commonly diagnosed malignancy among women worldwide, accounting for approximately 2.3 million new cases annually. Early and accurate diagnosis is critical for timely treatment and improved patient outcomes. Fine-needle aspiration cytology remains a widely used diagnostic procedure for evaluating breast masses, offering a minimally invasive approach with rapid turnaround. However, cytological interpretation is subject to interobserver variability, and diagnostic accuracy depends on the expertise of the interpreting pathologist.</w:t>
+        <w:t xml:space="preserve">Fine-needle aspiration (FNA) is a low-cost, minimally invasive sampling method for a palpable or imaged breast mass [1]. Digitized FNA images can be reduced to quantitative descriptors of nuclear size, texture, and cell-shape variability, and these descriptors separate malignant from benign lesions with substantial accuracy [2]. Translating such measurements into a reproducible classifier is a recurring task in diagnostic machine learning, and several model families are routinely applied without a clear consensus on which is preferable [3].</w:t>
       </w:r>
     </w:p>
     <w:p>
@@ -115,7 +389,7 @@
         <w:pStyle w:val="BodyText"/>
       </w:pPr>
       <w:r>
-        <w:t xml:space="preserve">Quantitative analysis of nuclear morphometric features from digitized FNA images offers the potential to reduce diagnostic subjectivity. Machine learning classifiers trained on these features can identify complex multivariate patterns that may be difficult to appreciate on visual inspection alone. Several prior studies have reported promising results using the Wisconsin Breast Cancer dataset as a benchmark, though systematic comparison of multiple classifier architectures with standardized performance reporting remains limited. To our knowledge, this is among the first studies to report a standardized STARD-compliant comparison of multiple classifier architectures on this dataset with complete confidence intervals and pairwise statistical testing.</w:t>
+        <w:t xml:space="preserve">Reporting of diagnostic-accuracy studies is governed by the STARD 2015 statement, which asks for an explicit reference standard, a participant flow diagram, and accuracy estimates accompanied by confidence intervals [4]. Comparative claims between competing index tests further require a test for the difference in discrimination rather than a side-by-side display of point estimates [5]. Many published comparisons report only AUC point estimates and omit the paired statistical test, leaving the reader unable to judge whether an apparent ranking is real.</w:t>
       </w:r>
     </w:p>
     <w:p>
@@ -123,26 +397,26 @@
         <w:pStyle w:val="BodyText"/>
       </w:pPr>
       <w:r>
-        <w:t xml:space="preserve">The purpose of this study was to evaluate and compare the diagnostic accuracy of three machine learning classifiers (logistic regression, random forest, and support vector machine) for distinguishing malignant from benign breast lesions using 30 nuclear morphometric features extracted from FNA cytology specimens.</w:t>
-      </w:r>
-    </w:p>
-    <w:bookmarkEnd w:id="10"/>
-    <w:bookmarkStart w:id="20" w:name="materials-and-methods"/>
+        <w:t xml:space="preserve">This study has two aims. The first is substantive: to estimate the diagnostic accuracy of three machine-learning classifiers for malignant-versus-benign FNA discrimination against a histopathology reference standard, and to test whether the classifiers differ. The second is methodological: the analysis serves as a clean-room demonstration of the medsci-skills v3.7.0 reproducible-reporting pipeline, in which every quantitative claim is traced to a committed analysis artifact and the manuscript is checked against deterministic style, reporting, and reference-adequacy gates.</w:t>
+      </w:r>
+    </w:p>
+    <w:bookmarkEnd w:id="22"/>
+    <w:bookmarkStart w:id="26" w:name="methods"/>
     <w:p>
       <w:pPr>
         <w:pStyle w:val="Heading2"/>
       </w:pPr>
       <w:r>
-        <w:t xml:space="preserve">Materials and Methods</w:t>
-      </w:r>
-    </w:p>
-    <w:bookmarkStart w:id="11" w:name="study-design-and-dataset"/>
+        <w:t xml:space="preserve">METHODS</w:t>
+      </w:r>
+    </w:p>
+    <w:bookmarkStart w:id="23" w:name="dataset-and-reference-standard"/>
     <w:p>
       <w:pPr>
         <w:pStyle w:val="Heading3"/>
       </w:pPr>
       <w:r>
-        <w:t xml:space="preserve">Study Design and Dataset</w:t>
+        <w:t xml:space="preserve">Dataset and reference standard</w:t>
       </w:r>
     </w:p>
     <w:p>
@@ -150,17 +424,17 @@
         <w:pStyle w:val="FirstParagraph"/>
       </w:pPr>
       <w:r>
-        <w:t xml:space="preserve">This retrospective diagnostic accuracy study used the Wisconsin Breast Cancer dataset, a publicly available benchmark dataset from the University of Wisconsin Hospitals. The dataset contains 569 FNA cytology samples from breast mass aspirates, with histologically confirmed diagnoses serving as the reference standard (212 malignant, 357 benign). Each sample includes 30 nuclear morphometric features computed from digitized images of FNA specimens: 10 mean values, 10 standard errors, and 10 worst (largest) values for the following nuclear characteristics: radius, texture, perimeter, area, smoothness, compactness, concavity, concave points, symmetry, and fractal dimension.</w:t>
-      </w:r>
-    </w:p>
-    <w:bookmarkEnd w:id="11"/>
-    <w:bookmarkStart w:id="12" w:name="participants"/>
+        <w:t xml:space="preserve">We used the Wisconsin Diagnostic Breast Cancer dataset as distributed with scikit-learn [6], comprising 569 FNA samples. Thirty cytomorphometric features (the mean, standard error, and worst value of ten nuclear measurements) were computed per sample. The reference standard for each sample was the histopathologic diagnosis, coded as malignant or benign; 212 samples were malignant and 357 were benign. No patient-level identifiers were present in the dataset.</w:t>
+      </w:r>
+    </w:p>
+    <w:bookmarkEnd w:id="23"/>
+    <w:bookmarkStart w:id="24" w:name="index-tests"/>
     <w:p>
       <w:pPr>
         <w:pStyle w:val="Heading3"/>
       </w:pPr>
       <w:r>
-        <w:t xml:space="preserve">Participants</w:t>
+        <w:t xml:space="preserve">Index tests</w:t>
       </w:r>
     </w:p>
     <w:p>
@@ -168,17 +442,17 @@
         <w:pStyle w:val="FirstParagraph"/>
       </w:pPr>
       <w:r>
-        <w:t xml:space="preserve">Inclusion criteria were: (a) female patients with breast masses who underwent FNA cytology and (b) availability of histologically confirmed diagnosis. No exclusion criteria were applied. The dataset represents a convenience sample of FNA specimens collected at the University of Wisconsin Hospitals. All patients were female, with a mean age of 54.3 years (SD, 11.5 years); note that age and sex were synthetically appended to the original feature-only dataset for demonstration purposes, as the Wisconsin Breast Cancer dataset contains only nuclear morphometric features. The prevalence of malignancy was 37.3% (212 of 569).</w:t>
-      </w:r>
-    </w:p>
-    <w:bookmarkEnd w:id="12"/>
-    <w:bookmarkStart w:id="13" w:name="index-test"/>
+        <w:t xml:space="preserve">Three index tests were evaluated: a logistic-regression classifier [7], a random-forest classifier with 400 trees [8], and a support-vector machine with a radial-basis-function kernel [9]. Continuous features were standardized to zero mean and unit variance using parameters estimated on the training set only, and the same transformation was applied to the test set to prevent information leakage. Each index test output a probability of malignancy.</w:t>
+      </w:r>
+    </w:p>
+    <w:bookmarkEnd w:id="24"/>
+    <w:bookmarkStart w:id="25" w:name="statistical-analysis"/>
     <w:p>
       <w:pPr>
         <w:pStyle w:val="Heading3"/>
       </w:pPr>
       <w:r>
-        <w:t xml:space="preserve">Index Test</w:t>
+        <w:t xml:space="preserve">Statistical analysis</w:t>
       </w:r>
     </w:p>
     <w:p>
@@ -186,17 +460,35 @@
         <w:pStyle w:val="FirstParagraph"/>
       </w:pPr>
       <w:r>
-        <w:t xml:space="preserve">Three machine learning classifiers served as the index tests: logistic regression, random forest (200 trees), and support vector machine with a radial basis function kernel. Default hyperparameters were used for all classifiers without cross-validation-based tuning, as the primary objective was architectural comparison under standardized conditions. All models received identical input: the 30 standardized nuclear morphometric features. A predicted probability threshold of 0.5 was used for binary classification (pre-specified). Feature standardization was performed using z-score normalization (mean = 0, SD = 1), with parameters calculated from the training set and applied to the test set to prevent data leakage.</w:t>
-      </w:r>
-    </w:p>
-    <w:bookmarkEnd w:id="13"/>
-    <w:bookmarkStart w:id="14" w:name="reference-standard"/>
+        <w:t xml:space="preserve">Samples were partitioned into a training set (n = 398) and a test set (n = 171) by a stratified 70/30 split with a fixed random seed (42); the test set preserved the malignant/benign proportion of the full dataset (64 malignant, 107 benign). All accuracy estimates were computed on the held-out test set.</w:t>
+      </w:r>
+    </w:p>
+    <w:p>
+      <w:pPr>
+        <w:pStyle w:val="BodyText"/>
+      </w:pPr>
+      <w:r>
+        <w:t xml:space="preserve">Discrimination was summarized by the area under the receiver-operating-characteristic curve (AUC), with 95% confidence intervals from the DeLong method [5]. At a fixed probability threshold of 0.5, sensitivity, specificity, positive predictive value, negative predictive value, and accuracy were computed, and binomial proportions were given Wilson 95% confidence intervals [10]. Probability calibration was summarized by the Brier score [11]. The Youden index was used to report an alternative operating threshold for each index test. Pairwise differences in AUC between index tests were tested with the DeLong method for correlated curves [5]; a two-sided p value below 0.05 was treated as evidence of a difference. Reporting followed the STARD 2015 statement [4]. Analyses used Python (scikit-learn [6] and SciPy [12]) with the random seed fixed at 42 for reproducibility.</w:t>
+      </w:r>
+    </w:p>
+    <w:bookmarkEnd w:id="25"/>
+    <w:bookmarkEnd w:id="26"/>
+    <w:bookmarkStart w:id="30" w:name="results"/>
+    <w:p>
+      <w:pPr>
+        <w:pStyle w:val="Heading2"/>
+      </w:pPr>
+      <w:r>
+        <w:t xml:space="preserve">RESULTS</w:t>
+      </w:r>
+    </w:p>
+    <w:bookmarkStart w:id="27" w:name="sample-characteristics"/>
     <w:p>
       <w:pPr>
         <w:pStyle w:val="Heading3"/>
       </w:pPr>
       <w:r>
-        <w:t xml:space="preserve">Reference Standard</w:t>
+        <w:t xml:space="preserve">Sample characteristics</w:t>
       </w:r>
     </w:p>
     <w:p>
@@ -204,17 +496,17 @@
         <w:pStyle w:val="FirstParagraph"/>
       </w:pPr>
       <w:r>
-        <w:t xml:space="preserve">The reference standard was histological diagnosis obtained from surgical biopsy or excision specimens, classified as malignant or benign. The reference standard was established independently of the index test results.</w:t>
-      </w:r>
-    </w:p>
-    <w:bookmarkEnd w:id="14"/>
-    <w:bookmarkStart w:id="15" w:name="sample-size"/>
+        <w:t xml:space="preserve">The 30 cytomorphometric features separated the two reference-standard classes strongly. Mean nuclear-concave-points was 0.09 (SD 0.03) in malignant versus 0.03 (SD 0.02) in benign samples (standardized mean difference 2.33), and mean perimeter was 115.37 (SD 21.85) versus 78.08 (SD 11.81; standardized mean difference 2.12); both differences were significant (p = 3.13 × 10⁻⁷¹ and p = 1.02 × 10⁻⁶⁶, respectively). Mean fractal dimension did not differ between classes (standardized mean difference −0.03; p = 0.767). Participant flow is shown in Figure 1.</w:t>
+      </w:r>
+    </w:p>
+    <w:bookmarkEnd w:id="27"/>
+    <w:bookmarkStart w:id="28" w:name="diagnostic-accuracy"/>
     <w:p>
       <w:pPr>
         <w:pStyle w:val="Heading3"/>
       </w:pPr>
       <w:r>
-        <w:t xml:space="preserve">Sample Size</w:t>
+        <w:t xml:space="preserve">Diagnostic accuracy</w:t>
       </w:r>
     </w:p>
     <w:p>
@@ -222,17 +514,25 @@
         <w:pStyle w:val="FirstParagraph"/>
       </w:pPr>
       <w:r>
-        <w:t xml:space="preserve">The sample size was determined by the availability of the complete dataset (N = 569). No a priori power analysis was performed, as this study used all available cases from the Wisconsin Breast Cancer dataset.</w:t>
-      </w:r>
-    </w:p>
-    <w:bookmarkEnd w:id="15"/>
-    <w:bookmarkStart w:id="16" w:name="data-partitioning"/>
+        <w:t xml:space="preserve">On the test set (n = 171), logistic regression reached an AUC of 0.998 (95% CI 0.994–1.000). At the 0.5 probability threshold it correctly classified 60 of 64 malignant and 106 of 107 benign samples, giving a sensitivity of 0.938 (95% CI 0.850–0.975), a specificity of 0.991 (95% CI 0.949–0.998), a positive predictive value of 0.984, a negative predictive value of 0.964, and an accuracy of 0.971. Its Brier score was 0.019, the lowest of the three index tests.</w:t>
+      </w:r>
+    </w:p>
+    <w:p>
+      <w:pPr>
+        <w:pStyle w:val="BodyText"/>
+      </w:pPr>
+      <w:r>
+        <w:t xml:space="preserve">The random forest reached an AUC of 0.996 (95% CI 0.991–1.000), with sensitivity 0.922 (95% CI 0.830–0.966), specificity 1.000 (95% CI 0.965–1.000), and a Brier score of 0.029. The support-vector machine reached an AUC of 0.997 (95% CI 0.992–1.000), with sensitivity 0.922 (95% CI 0.830–0.966), specificity 1.000 (95% CI 0.965–1.000), and a Brier score of 0.020. The receiver-operating-characteristic curves are shown in Figure 2 and the confusion matrices at the 0.5 threshold in Figure 3.</w:t>
+      </w:r>
+    </w:p>
+    <w:bookmarkEnd w:id="28"/>
+    <w:bookmarkStart w:id="29" w:name="pairwise-comparison-of-discrimination"/>
     <w:p>
       <w:pPr>
         <w:pStyle w:val="Heading3"/>
       </w:pPr>
       <w:r>
-        <w:t xml:space="preserve">Data Partitioning</w:t>
+        <w:t xml:space="preserve">Pairwise comparison of discrimination</w:t>
       </w:r>
     </w:p>
     <w:p>
@@ -240,17 +540,18 @@
         <w:pStyle w:val="FirstParagraph"/>
       </w:pPr>
       <w:r>
-        <w:t xml:space="preserve">The dataset was split into training (n = 455, 80%) and test (n = 114, 20%) sets using stratified random sampling to preserve the malignant-to-benign ratio in both subsets. All model training and hyperparameter selection occurred on the training set. Final performance evaluation was conducted exclusively on the held-out test set. A fixed random seed (42) was used throughout.</w:t>
-      </w:r>
-    </w:p>
-    <w:bookmarkEnd w:id="16"/>
-    <w:bookmarkStart w:id="17" w:name="statistical-analysis"/>
-    <w:p>
-      <w:pPr>
-        <w:pStyle w:val="Heading3"/>
-      </w:pPr>
-      <w:r>
-        <w:t xml:space="preserve">Statistical Analysis</w:t>
+        <w:t xml:space="preserve">The three index tests were statistically indistinguishable in discrimination. Pairwise DeLong tests gave p = 0.554 for logistic regression versus random forest, p = 0.800 for logistic regression versus the support-vector machine, and p = 0.640 for random forest versus the support-vector machine. No pairwise difference approached significance.</w:t>
+      </w:r>
+    </w:p>
+    <w:bookmarkEnd w:id="29"/>
+    <w:bookmarkEnd w:id="30"/>
+    <w:bookmarkStart w:id="31" w:name="discussion"/>
+    <w:p>
+      <w:pPr>
+        <w:pStyle w:val="Heading2"/>
+      </w:pPr>
+      <w:r>
+        <w:t xml:space="preserve">DISCUSSION</w:t>
       </w:r>
     </w:p>
     <w:p>
@@ -258,17 +559,49 @@
         <w:pStyle w:val="FirstParagraph"/>
       </w:pPr>
       <w:r>
-        <w:t xml:space="preserve">Diagnostic performance metrics included AUC, sensitivity, specificity, PPV, NPV, accuracy, and F1 score. The 95% CIs for AUC values were estimated using bootstrap resampling (2000 iterations). Pairwise comparisons of AUC values between classifiers were performed using bootstrap resampling, with a two-sided p value less than 0.05 considered statistically significant. Baseline characteristics were compared between diagnostic groups using the independent-samples t-test for continuous variables. All analyses were performed using Python 3 with scikit-learn and SciPy.</w:t>
-      </w:r>
-    </w:p>
-    <w:bookmarkEnd w:id="17"/>
-    <w:bookmarkStart w:id="18" w:name="ethics-statement"/>
-    <w:p>
-      <w:pPr>
-        <w:pStyle w:val="Heading3"/>
-      </w:pPr>
-      <w:r>
-        <w:t xml:space="preserve">Ethics Statement</w:t>
+        <w:t xml:space="preserve">Three routine machine-learning classifiers discriminated malignant from benign breast FNA samples with very high accuracy on this benchmark, and the differences among them were not statistically significant. Logistic regression, the simplest model, matched the two more flexible models on discrimination and gave the best probability calibration (Brier score 0.019). For a feature set this separable, model complexity bought no measurable gain in discrimination, which argues for preferring the model that is easiest to calibrate and interpret.</w:t>
+      </w:r>
+    </w:p>
+    <w:p>
+      <w:pPr>
+        <w:pStyle w:val="BodyText"/>
+      </w:pPr>
+      <w:r>
+        <w:t xml:space="preserve">These findings agree with the broader observation that, on well-separated tabular feature sets, regularized linear models are often competitive with ensemble and kernel methods [3]. The practical implication is that a comparative diagnostic study should report a paired test of discrimination, as the STARD framework and the DeLong method jointly recommend [4,5]; had we reported only the AUC point estimates, logistic regression’s 0.998 would appear to outrank the random forest’s 0.996, yet that ordering is within sampling noise (p = 0.554).</w:t>
+      </w:r>
+    </w:p>
+    <w:p>
+      <w:pPr>
+        <w:pStyle w:val="BodyText"/>
+      </w:pPr>
+      <w:r>
+        <w:t xml:space="preserve">This study has clear limitations. The dataset is a curated, single-source benchmark with a high malignant prevalence relative to a screening population, so the reported predictive values are not transportable to clinical practice. There was no external validation cohort and no assessment across image-acquisition sites or operators. The 0.5 probability threshold is conventional rather than clinically optimized, although Youden-based thresholds are reported alongside it for each index test. Finally, the references in this manuscript are unverified placeholders: the analysis is a reproducibility demonstration of the medsci-skills v3.7.0 pipeline, not a clinical validation, and the manuscript should not be cited as evidence for clinical deployment.</w:t>
+      </w:r>
+    </w:p>
+    <w:p>
+      <w:pPr>
+        <w:pStyle w:val="BodyText"/>
+      </w:pPr>
+      <w:r>
+        <w:t xml:space="preserve">Within those limits, the analysis demonstrates a fully traceable diagnostic-accuracy workflow: a STARD-compliant participant flow, AUC estimates with DeLong intervals, threshold metrics with Wilson intervals, a calibration score, and a paired test of discrimination, with every reported number tracing to a committed analysis table.</w:t>
+      </w:r>
+    </w:p>
+    <w:p>
+      <w:pPr>
+        <w:pStyle w:val="BodyText"/>
+      </w:pPr>
+      <w:r>
+        <w:t xml:space="preserve">In summary, logistic regression, random forest, and a radial-basis-function support-vector machine all distinguished malignant from benign breast FNA samples with statistically indistinguishable, very high accuracy on the Wisconsin benchmark; logistic regression is the most attractive of the three because it matches the others on discrimination while offering the best calibration and the simplest model.</w:t>
+      </w:r>
+    </w:p>
+    <w:bookmarkEnd w:id="31"/>
+    <w:bookmarkStart w:id="32" w:name="data-availability"/>
+    <w:p>
+      <w:pPr>
+        <w:pStyle w:val="Heading2"/>
+      </w:pPr>
+      <w:r>
+        <w:t xml:space="preserve">Data Availability</w:t>
       </w:r>
     </w:p>
     <w:p>
@@ -276,300 +609,53 @@
         <w:pStyle w:val="FirstParagraph"/>
       </w:pPr>
       <w:r>
-        <w:t xml:space="preserve">This study used a publicly available, de-identified dataset (University of Wisconsin Breast Cancer dataset, available through the UCI Machine Learning Repository and scikit-learn). No institutional review board approval was required.</w:t>
-      </w:r>
-    </w:p>
-    <w:bookmarkEnd w:id="18"/>
-    <w:bookmarkStart w:id="19" w:name="ai-assisted-writing-disclosure"/>
-    <w:p>
-      <w:pPr>
-        <w:pStyle w:val="Heading3"/>
-      </w:pPr>
-      <w:r>
-        <w:t xml:space="preserve">AI-Assisted Writing Disclosure</w:t>
+        <w:t xml:space="preserve">The dataset is the Wisconsin Diagnostic Breast Cancer dataset distributed publicly with scikit-learn (</w:t>
+      </w:r>
+      <w:r>
+        <w:rPr>
+          <w:rStyle w:val="VerbatimChar"/>
+        </w:rPr>
+        <w:t xml:space="preserve">sklearn.datasets.load_breast_cancer</w:t>
+      </w:r>
+      <w:r>
+        <w:t xml:space="preserve">). All analysis code, derived tables, figures, and a reproducibility lock file accompany this demonstration. The complete per-sample test-set predicted probabilities for all three index tests are released alongside the reference-standard labels (</w:t>
+      </w:r>
+      <w:r>
+        <w:rPr>
+          <w:rStyle w:val="VerbatimChar"/>
+        </w:rPr>
+        <w:t xml:space="preserve">predictions.csv</w:t>
+      </w:r>
+      <w:r>
+        <w:t xml:space="preserve">), so that every accuracy estimate, confidence interval, and DeLong comparison reported here can be recomputed independently.</w:t>
+      </w:r>
+    </w:p>
+    <w:bookmarkEnd w:id="32"/>
+    <w:bookmarkStart w:id="33" w:name="figure-legends"/>
+    <w:p>
+      <w:pPr>
+        <w:pStyle w:val="Heading2"/>
+      </w:pPr>
+      <w:r>
+        <w:t xml:space="preserve">Figure Legends</w:t>
       </w:r>
     </w:p>
     <w:p>
       <w:pPr>
         <w:pStyle w:val="FirstParagraph"/>
-      </w:pPr>
-      <w:r>
-        <w:t xml:space="preserve">An artificial intelligence language model (Claude, Anthropic) was used to assist with manuscript drafting, including structuring sections, refining prose, and verifying internal consistency of reported statistics. All content was critically reviewed, verified against source data, and approved by all authors. The AI tool was not involved in study design, data collection, data analysis, or interpretation of results.</w:t>
-      </w:r>
-    </w:p>
-    <w:bookmarkEnd w:id="19"/>
-    <w:bookmarkEnd w:id="20"/>
-    <w:bookmarkStart w:id="33" w:name="results"/>
-    <w:p>
-      <w:pPr>
-        <w:pStyle w:val="Heading2"/>
-      </w:pPr>
-      <w:r>
-        <w:t xml:space="preserve">Results</w:t>
-      </w:r>
-    </w:p>
-    <w:bookmarkStart w:id="24" w:name="study-population"/>
-    <w:p>
-      <w:pPr>
-        <w:pStyle w:val="Heading3"/>
-      </w:pPr>
-      <w:r>
-        <w:t xml:space="preserve">Study Population</w:t>
-      </w:r>
-    </w:p>
-    <w:p>
-      <w:pPr>
-        <w:pStyle w:val="FirstParagraph"/>
-      </w:pPr>
-      <w:r>
-        <w:t xml:space="preserve">A total of 569 FNA cytology samples were included in the analysis (Figure 1). The study population comprised 212 malignant (37.3%) and 357 benign (62.7%) samples. The mean age was 55.1 years (SD, 10.6 years) in the malignant group and 53.8 years (SD, 11.9 years) in the benign group, with no statistically significant difference between groups (t = 1.23, p = 0.219) (Table 1). All patients were female. The training set contained 455 samples and the test set contained 114 samples.</w:t>
-      </w:r>
-    </w:p>
-    <w:p>
-      <w:pPr>
-        <w:pStyle w:val="CaptionedFigure"/>
-      </w:pPr>
-      <w:r>
-        <w:drawing>
-          <wp:inline>
-            <wp:extent cx="5334000" cy="9334500"/>
-            <wp:effectExtent b="0" l="0" r="0" t="0"/>
-            <wp:docPr descr="Figure 1. STARD flow diagram showing participant enrollment, data partitioning, and diagnostic evaluation." title="" id="22" name="Picture"/>
-            <a:graphic>
-              <a:graphicData uri="http://schemas.openxmlformats.org/drawingml/2006/picture">
-                <pic:pic>
-                  <pic:nvPicPr>
-                    <pic:cNvPr descr="figures/stard_flow.png" id="23" name="Picture"/>
-                    <pic:cNvPicPr>
-                      <a:picLocks noChangeArrowheads="1" noChangeAspect="1"/>
-                    </pic:cNvPicPr>
-                  </pic:nvPicPr>
-                  <pic:blipFill>
-                    <a:blip r:embed="rId21"/>
-                    <a:stretch>
-                      <a:fillRect/>
-                    </a:stretch>
-                  </pic:blipFill>
-                  <pic:spPr bwMode="auto">
-                    <a:xfrm>
-                      <a:off x="0" y="0"/>
-                      <a:ext cx="5334000" cy="9334500"/>
-                    </a:xfrm>
-                    <a:prstGeom prst="rect">
-                      <a:avLst/>
-                    </a:prstGeom>
-                    <a:noFill/>
-                    <a:ln w="9525">
-                      <a:noFill/>
-                      <a:headEnd/>
-                      <a:tailEnd/>
-                    </a:ln>
-                  </pic:spPr>
-                </pic:pic>
-              </a:graphicData>
-            </a:graphic>
-          </wp:inline>
-        </w:drawing>
-      </w:r>
-    </w:p>
-    <w:p>
-      <w:pPr>
-        <w:pStyle w:val="ImageCaption"/>
-      </w:pPr>
-      <w:r>
-        <w:t xml:space="preserve">Figure 1. STARD flow diagram showing participant enrollment, data partitioning, and diagnostic evaluation.</w:t>
-      </w:r>
-    </w:p>
-    <w:p>
-      <w:pPr>
-        <w:pStyle w:val="BodyText"/>
       </w:pPr>
       <w:r>
         <w:rPr>
           <w:b/>
           <w:bCs/>
         </w:rPr>
-        <w:t xml:space="preserve">Table 1. Baseline Characteristics of the Study Population</w:t>
-      </w:r>
-    </w:p>
-    <w:tbl>
-      <w:tblPr>
-        <w:tblStyle w:val="Table"/>
-        <w:tblW w:type="auto" w:w="0"/>
-        <w:tblLook w:firstRow="1" w:lastRow="0" w:firstColumn="0" w:lastColumn="0" w:noHBand="0" w:noVBand="0" w:val="0020"/>
-      </w:tblPr>
-      <w:tblGrid>
-        <w:gridCol w:w="1980"/>
-        <w:gridCol w:w="1980"/>
-        <w:gridCol w:w="1980"/>
-        <w:gridCol w:w="1980"/>
-      </w:tblGrid>
-      <w:tr>
-        <w:trPr>
-          <w:tblHeader w:val="on"/>
-        </w:trPr>
-        <w:tc>
-          <w:tcPr/>
-          <w:p>
-            <w:pPr>
-              <w:pStyle w:val="Compact"/>
-            </w:pPr>
-            <w:r>
-              <w:t xml:space="preserve">Characteristic</w:t>
-            </w:r>
-          </w:p>
-        </w:tc>
-        <w:tc>
-          <w:tcPr/>
-          <w:p>
-            <w:pPr>
-              <w:pStyle w:val="Compact"/>
-            </w:pPr>
-            <w:r>
-              <w:t xml:space="preserve">Malignant (n = 212)</w:t>
-            </w:r>
-          </w:p>
-        </w:tc>
-        <w:tc>
-          <w:tcPr/>
-          <w:p>
-            <w:pPr>
-              <w:pStyle w:val="Compact"/>
-            </w:pPr>
-            <w:r>
-              <w:t xml:space="preserve">Benign (n = 357)</w:t>
-            </w:r>
-          </w:p>
-        </w:tc>
-        <w:tc>
-          <w:tcPr/>
-          <w:p>
-            <w:pPr>
-              <w:pStyle w:val="Compact"/>
-            </w:pPr>
-            <w:r>
-              <w:t xml:space="preserve">P value</w:t>
-            </w:r>
-          </w:p>
-        </w:tc>
-      </w:tr>
-      <w:tr>
-        <w:tc>
-          <w:tcPr/>
-          <w:p>
-            <w:pPr>
-              <w:pStyle w:val="Compact"/>
-            </w:pPr>
-            <w:r>
-              <w:t xml:space="preserve">Age, mean (SD), y</w:t>
-            </w:r>
-          </w:p>
-        </w:tc>
-        <w:tc>
-          <w:tcPr/>
-          <w:p>
-            <w:pPr>
-              <w:pStyle w:val="Compact"/>
-            </w:pPr>
-            <w:r>
-              <w:t xml:space="preserve">55.1 (10.6)</w:t>
-            </w:r>
-          </w:p>
-        </w:tc>
-        <w:tc>
-          <w:tcPr/>
-          <w:p>
-            <w:pPr>
-              <w:pStyle w:val="Compact"/>
-            </w:pPr>
-            <w:r>
-              <w:t xml:space="preserve">53.8 (11.9)</w:t>
-            </w:r>
-          </w:p>
-        </w:tc>
-        <w:tc>
-          <w:tcPr/>
-          <w:p>
-            <w:pPr>
-              <w:pStyle w:val="Compact"/>
-            </w:pPr>
-            <w:r>
-              <w:t xml:space="preserve">0.219</w:t>
-            </w:r>
-          </w:p>
-        </w:tc>
-      </w:tr>
-      <w:tr>
-        <w:tc>
-          <w:tcPr/>
-          <w:p>
-            <w:pPr>
-              <w:pStyle w:val="Compact"/>
-            </w:pPr>
-            <w:r>
-              <w:t xml:space="preserve">Sex, female, No. (%)</w:t>
-            </w:r>
-          </w:p>
-        </w:tc>
-        <w:tc>
-          <w:tcPr/>
-          <w:p>
-            <w:pPr>
-              <w:pStyle w:val="Compact"/>
-            </w:pPr>
-            <w:r>
-              <w:t xml:space="preserve">212 (100.0)</w:t>
-            </w:r>
-          </w:p>
-        </w:tc>
-        <w:tc>
-          <w:tcPr/>
-          <w:p>
-            <w:pPr>
-              <w:pStyle w:val="Compact"/>
-            </w:pPr>
-            <w:r>
-              <w:t xml:space="preserve">357 (100.0)</w:t>
-            </w:r>
-          </w:p>
-        </w:tc>
-        <w:tc>
-          <w:tcPr/>
-          <w:p>
-            <w:pPr>
-              <w:pStyle w:val="Compact"/>
-            </w:pPr>
-            <w:r>
-              <w:t xml:space="preserve">—</w:t>
-            </w:r>
-          </w:p>
-        </w:tc>
-      </w:tr>
-    </w:tbl>
-    <w:p>
-      <w:pPr>
-        <w:pStyle w:val="BodyText"/>
-      </w:pPr>
-      <w:r>
-        <w:t xml:space="preserve">Data are mean (SD) or No. (%). P value from independent-samples t-test.</w:t>
-      </w:r>
-    </w:p>
-    <w:bookmarkEnd w:id="24"/>
-    <w:bookmarkStart w:id="31" w:name="diagnostic-performance"/>
-    <w:p>
-      <w:pPr>
-        <w:pStyle w:val="Heading3"/>
-      </w:pPr>
-      <w:r>
-        <w:t xml:space="preserve">Diagnostic Performance</w:t>
-      </w:r>
-    </w:p>
-    <w:p>
-      <w:pPr>
-        <w:pStyle w:val="FirstParagraph"/>
-      </w:pPr>
-      <w:r>
-        <w:t xml:space="preserve">All three classifiers demonstrated high diagnostic accuracy on the test set (n = 114) (Table 2; Figure 2). The LR classifier achieved an AUC of 0.996 (95% CI: 0.986-1.000), the SVM classifier achieved an AUC of 0.995 (95% CI: 0.983-1.000), and the RF classifier achieved an AUC of 0.994 (95% CI: 0.984-1.000). Pairwise bootstrap comparisons did not demonstrate statistically significant differences in AUC between any pair of classifiers (LR vs RF, p = 0.589; LR vs SVM, p = 0.513; RF vs SVM, p = 0.822).</w:t>
+        <w:t xml:space="preserve">Figure 1.</w:t>
+      </w:r>
+      <w:r>
+        <w:t xml:space="preserve"> </w:t>
+      </w:r>
+      <w:r>
+        <w:t xml:space="preserve">STARD 2015 participant flow diagram. The 569 FNA samples were partitioned by a stratified 70/30 split (seed 42) into a training set (n = 398) and a test set (n = 171). The histopathology reference standard was applied to all test samples (64 malignant, 107 benign). The 2×2 cell counts shown are for the logistic-regression index test at a 0.5 probability threshold (TP = 60, FP = 1, FN = 4, TN = 106).</w:t>
       </w:r>
     </w:p>
     <w:p>
@@ -581,627 +667,67 @@
           <w:b/>
           <w:bCs/>
         </w:rPr>
-        <w:t xml:space="preserve">Table 2. Diagnostic Accuracy of Machine Learning Classifiers on the Test Set (n = 114)</w:t>
-      </w:r>
-    </w:p>
-    <w:tbl>
-      <w:tblPr>
-        <w:tblStyle w:val="Table"/>
-        <w:tblW w:type="pct" w:w="5000"/>
-        <w:tblLayout w:type="fixed"/>
-        <w:tblLook w:firstRow="1" w:lastRow="0" w:firstColumn="0" w:lastColumn="0" w:noHBand="0" w:noVBand="0" w:val="0020"/>
-      </w:tblPr>
-      <w:tblGrid>
-        <w:gridCol w:w="990"/>
-        <w:gridCol w:w="990"/>
-        <w:gridCol w:w="990"/>
-        <w:gridCol w:w="990"/>
-        <w:gridCol w:w="990"/>
-        <w:gridCol w:w="990"/>
-        <w:gridCol w:w="990"/>
-        <w:gridCol w:w="990"/>
-      </w:tblGrid>
-      <w:tr>
-        <w:trPr>
-          <w:tblHeader w:val="on"/>
-        </w:trPr>
-        <w:tc>
-          <w:tcPr/>
-          <w:p>
-            <w:pPr>
-              <w:pStyle w:val="Compact"/>
-            </w:pPr>
-            <w:r>
-              <w:t xml:space="preserve">Model</w:t>
-            </w:r>
-          </w:p>
-        </w:tc>
-        <w:tc>
-          <w:tcPr/>
-          <w:p>
-            <w:pPr>
-              <w:pStyle w:val="Compact"/>
-            </w:pPr>
-            <w:r>
-              <w:t xml:space="preserve">AUC (95% CI)</w:t>
-            </w:r>
-          </w:p>
-        </w:tc>
-        <w:tc>
-          <w:tcPr/>
-          <w:p>
-            <w:pPr>
-              <w:pStyle w:val="Compact"/>
-            </w:pPr>
-            <w:r>
-              <w:t xml:space="preserve">Sensitivity</w:t>
-            </w:r>
-          </w:p>
-        </w:tc>
-        <w:tc>
-          <w:tcPr/>
-          <w:p>
-            <w:pPr>
-              <w:pStyle w:val="Compact"/>
-            </w:pPr>
-            <w:r>
-              <w:t xml:space="preserve">Specificity</w:t>
-            </w:r>
-          </w:p>
-        </w:tc>
-        <w:tc>
-          <w:tcPr/>
-          <w:p>
-            <w:pPr>
-              <w:pStyle w:val="Compact"/>
-            </w:pPr>
-            <w:r>
-              <w:t xml:space="preserve">PPV</w:t>
-            </w:r>
-          </w:p>
-        </w:tc>
-        <w:tc>
-          <w:tcPr/>
-          <w:p>
-            <w:pPr>
-              <w:pStyle w:val="Compact"/>
-            </w:pPr>
-            <w:r>
-              <w:t xml:space="preserve">NPV</w:t>
-            </w:r>
-          </w:p>
-        </w:tc>
-        <w:tc>
-          <w:tcPr/>
-          <w:p>
-            <w:pPr>
-              <w:pStyle w:val="Compact"/>
-            </w:pPr>
-            <w:r>
-              <w:t xml:space="preserve">Accuracy</w:t>
-            </w:r>
-          </w:p>
-        </w:tc>
-        <w:tc>
-          <w:tcPr/>
-          <w:p>
-            <w:pPr>
-              <w:pStyle w:val="Compact"/>
-            </w:pPr>
-            <w:r>
-              <w:t xml:space="preserve">F1</w:t>
-            </w:r>
-          </w:p>
-        </w:tc>
-      </w:tr>
-      <w:tr>
-        <w:tc>
-          <w:tcPr/>
-          <w:p>
-            <w:pPr>
-              <w:pStyle w:val="Compact"/>
-            </w:pPr>
-            <w:r>
-              <w:t xml:space="preserve">Logistic Regression</w:t>
-            </w:r>
-          </w:p>
-        </w:tc>
-        <w:tc>
-          <w:tcPr/>
-          <w:p>
-            <w:pPr>
-              <w:pStyle w:val="Compact"/>
-            </w:pPr>
-            <w:r>
-              <w:t xml:space="preserve">0.996 (0.986-1.000)</w:t>
-            </w:r>
-          </w:p>
-        </w:tc>
-        <w:tc>
-          <w:tcPr/>
-          <w:p>
-            <w:pPr>
-              <w:pStyle w:val="Compact"/>
-            </w:pPr>
-            <w:r>
-              <w:t xml:space="preserve">0.929</w:t>
-            </w:r>
-          </w:p>
-        </w:tc>
-        <w:tc>
-          <w:tcPr/>
-          <w:p>
-            <w:pPr>
-              <w:pStyle w:val="Compact"/>
-            </w:pPr>
-            <w:r>
-              <w:t xml:space="preserve">0.986</w:t>
-            </w:r>
-          </w:p>
-        </w:tc>
-        <w:tc>
-          <w:tcPr/>
-          <w:p>
-            <w:pPr>
-              <w:pStyle w:val="Compact"/>
-            </w:pPr>
-            <w:r>
-              <w:t xml:space="preserve">0.975</w:t>
-            </w:r>
-          </w:p>
-        </w:tc>
-        <w:tc>
-          <w:tcPr/>
-          <w:p>
-            <w:pPr>
-              <w:pStyle w:val="Compact"/>
-            </w:pPr>
-            <w:r>
-              <w:t xml:space="preserve">0.959</w:t>
-            </w:r>
-          </w:p>
-        </w:tc>
-        <w:tc>
-          <w:tcPr/>
-          <w:p>
-            <w:pPr>
-              <w:pStyle w:val="Compact"/>
-            </w:pPr>
-            <w:r>
-              <w:t xml:space="preserve">0.965</w:t>
-            </w:r>
-          </w:p>
-        </w:tc>
-        <w:tc>
-          <w:tcPr/>
-          <w:p>
-            <w:pPr>
-              <w:pStyle w:val="Compact"/>
-            </w:pPr>
-            <w:r>
-              <w:t xml:space="preserve">0.951</w:t>
-            </w:r>
-          </w:p>
-        </w:tc>
-      </w:tr>
-      <w:tr>
-        <w:tc>
-          <w:tcPr/>
-          <w:p>
-            <w:pPr>
-              <w:pStyle w:val="Compact"/>
-            </w:pPr>
-            <w:r>
-              <w:t xml:space="preserve">Random Forest</w:t>
-            </w:r>
-          </w:p>
-        </w:tc>
-        <w:tc>
-          <w:tcPr/>
-          <w:p>
-            <w:pPr>
-              <w:pStyle w:val="Compact"/>
-            </w:pPr>
-            <w:r>
-              <w:t xml:space="preserve">0.994 (0.984-1.000)</w:t>
-            </w:r>
-          </w:p>
-        </w:tc>
-        <w:tc>
-          <w:tcPr/>
-          <w:p>
-            <w:pPr>
-              <w:pStyle w:val="Compact"/>
-            </w:pPr>
-            <w:r>
-              <w:t xml:space="preserve">0.905</w:t>
-            </w:r>
-          </w:p>
-        </w:tc>
-        <w:tc>
-          <w:tcPr/>
-          <w:p>
-            <w:pPr>
-              <w:pStyle w:val="Compact"/>
-            </w:pPr>
-            <w:r>
-              <w:t xml:space="preserve">1.000</w:t>
-            </w:r>
-          </w:p>
-        </w:tc>
-        <w:tc>
-          <w:tcPr/>
-          <w:p>
-            <w:pPr>
-              <w:pStyle w:val="Compact"/>
-            </w:pPr>
-            <w:r>
-              <w:t xml:space="preserve">1.000</w:t>
-            </w:r>
-          </w:p>
-        </w:tc>
-        <w:tc>
-          <w:tcPr/>
-          <w:p>
-            <w:pPr>
-              <w:pStyle w:val="Compact"/>
-            </w:pPr>
-            <w:r>
-              <w:t xml:space="preserve">0.947</w:t>
-            </w:r>
-          </w:p>
-        </w:tc>
-        <w:tc>
-          <w:tcPr/>
-          <w:p>
-            <w:pPr>
-              <w:pStyle w:val="Compact"/>
-            </w:pPr>
-            <w:r>
-              <w:t xml:space="preserve">0.965</w:t>
-            </w:r>
-          </w:p>
-        </w:tc>
-        <w:tc>
-          <w:tcPr/>
-          <w:p>
-            <w:pPr>
-              <w:pStyle w:val="Compact"/>
-            </w:pPr>
-            <w:r>
-              <w:t xml:space="preserve">0.950</w:t>
-            </w:r>
-          </w:p>
-        </w:tc>
-      </w:tr>
-      <w:tr>
-        <w:tc>
-          <w:tcPr/>
-          <w:p>
-            <w:pPr>
-              <w:pStyle w:val="Compact"/>
-            </w:pPr>
-            <w:r>
-              <w:t xml:space="preserve">SVM</w:t>
-            </w:r>
-          </w:p>
-        </w:tc>
-        <w:tc>
-          <w:tcPr/>
-          <w:p>
-            <w:pPr>
-              <w:pStyle w:val="Compact"/>
-            </w:pPr>
-            <w:r>
-              <w:t xml:space="preserve">0.995 (0.983-1.000)</w:t>
-            </w:r>
-          </w:p>
-        </w:tc>
-        <w:tc>
-          <w:tcPr/>
-          <w:p>
-            <w:pPr>
-              <w:pStyle w:val="Compact"/>
-            </w:pPr>
-            <w:r>
-              <w:t xml:space="preserve">0.929</w:t>
-            </w:r>
-          </w:p>
-        </w:tc>
-        <w:tc>
-          <w:tcPr/>
-          <w:p>
-            <w:pPr>
-              <w:pStyle w:val="Compact"/>
-            </w:pPr>
-            <w:r>
-              <w:t xml:space="preserve">1.000</w:t>
-            </w:r>
-          </w:p>
-        </w:tc>
-        <w:tc>
-          <w:tcPr/>
-          <w:p>
-            <w:pPr>
-              <w:pStyle w:val="Compact"/>
-            </w:pPr>
-            <w:r>
-              <w:t xml:space="preserve">1.000</w:t>
-            </w:r>
-          </w:p>
-        </w:tc>
-        <w:tc>
-          <w:tcPr/>
-          <w:p>
-            <w:pPr>
-              <w:pStyle w:val="Compact"/>
-            </w:pPr>
-            <w:r>
-              <w:t xml:space="preserve">0.960</w:t>
-            </w:r>
-          </w:p>
-        </w:tc>
-        <w:tc>
-          <w:tcPr/>
-          <w:p>
-            <w:pPr>
-              <w:pStyle w:val="Compact"/>
-            </w:pPr>
-            <w:r>
-              <w:t xml:space="preserve">0.974</w:t>
-            </w:r>
-          </w:p>
-        </w:tc>
-        <w:tc>
-          <w:tcPr/>
-          <w:p>
-            <w:pPr>
-              <w:pStyle w:val="Compact"/>
-            </w:pPr>
-            <w:r>
-              <w:t xml:space="preserve">0.963</w:t>
-            </w:r>
-          </w:p>
-        </w:tc>
-      </w:tr>
-    </w:tbl>
+        <w:t xml:space="preserve">Figure 2.</w:t>
+      </w:r>
+      <w:r>
+        <w:t xml:space="preserve"> </w:t>
+      </w:r>
+      <w:r>
+        <w:t xml:space="preserve">Receiver-operating-characteristic curves for the three index tests on the test set, with DeLong AUC and 95% confidence interval in the legend.</w:t>
+      </w:r>
+    </w:p>
     <w:p>
       <w:pPr>
         <w:pStyle w:val="BodyText"/>
       </w:pPr>
       <w:r>
-        <w:t xml:space="preserve">Data are from the held-out test set (n = 114; 42 malignant, 72 benign). AUC 95% CIs from bootstrap resampling (2000 iterations). Confidence intervals for sensitivity, specificity, PPV, and NPV were not computed; Wilson score intervals should be added in future analyses. PPV = positive predictive value; NPV = negative predictive value.</w:t>
-      </w:r>
-    </w:p>
-    <w:p>
-      <w:pPr>
-        <w:pStyle w:val="BodyText"/>
-      </w:pPr>
-      <w:r>
-        <w:t xml:space="preserve">The SVM classifier achieved the highest overall accuracy (0.974), with a sensitivity of 0.929 (39 of 42 malignant cases correctly identified) and perfect specificity of 1.000 (72 of 72 benign cases correctly classified). The RF classifier also demonstrated perfect specificity (1.000) but had lower sensitivity (0.905, 38 of 42). The LR classifier had a sensitivity of 0.929 and specificity of 0.986 (one false positive among 72 benign cases) (Figure 3).</w:t>
-      </w:r>
-    </w:p>
-    <w:p>
-      <w:pPr>
-        <w:pStyle w:val="CaptionedFigure"/>
-      </w:pPr>
-      <w:r>
-        <w:drawing>
-          <wp:inline>
-            <wp:extent cx="4428264" cy="4431323"/>
-            <wp:effectExtent b="0" l="0" r="0" t="0"/>
-            <wp:docPr descr="Figure 2. Receiver operating characteristic curves for the three classifiers on the test set. AUC = area under the curve; CI = confidence interval; LR = logistic regression; RF = random forest; SVM = support vector machine." title="" id="26" name="Picture"/>
-            <a:graphic>
-              <a:graphicData uri="http://schemas.openxmlformats.org/drawingml/2006/picture">
-                <pic:pic>
-                  <pic:nvPicPr>
-                    <pic:cNvPr descr="figures/roc_curve.png" id="27" name="Picture"/>
-                    <pic:cNvPicPr>
-                      <a:picLocks noChangeArrowheads="1" noChangeAspect="1"/>
-                    </pic:cNvPicPr>
-                  </pic:nvPicPr>
-                  <pic:blipFill>
-                    <a:blip r:embed="rId25"/>
-                    <a:stretch>
-                      <a:fillRect/>
-                    </a:stretch>
-                  </pic:blipFill>
-                  <pic:spPr bwMode="auto">
-                    <a:xfrm>
-                      <a:off x="0" y="0"/>
-                      <a:ext cx="4428264" cy="4431323"/>
-                    </a:xfrm>
-                    <a:prstGeom prst="rect">
-                      <a:avLst/>
-                    </a:prstGeom>
-                    <a:noFill/>
-                    <a:ln w="9525">
-                      <a:noFill/>
-                      <a:headEnd/>
-                      <a:tailEnd/>
-                    </a:ln>
-                  </pic:spPr>
-                </pic:pic>
-              </a:graphicData>
-            </a:graphic>
-          </wp:inline>
-        </w:drawing>
-      </w:r>
-    </w:p>
-    <w:p>
-      <w:pPr>
-        <w:pStyle w:val="ImageCaption"/>
-      </w:pPr>
-      <w:r>
-        <w:t xml:space="preserve">Figure 2. Receiver operating characteristic curves for the three classifiers on the test set. AUC = area under the curve; CI = confidence interval; LR = logistic regression; RF = random forest; SVM = support vector machine.</w:t>
-      </w:r>
-    </w:p>
-    <w:p>
-      <w:pPr>
-        <w:pStyle w:val="CaptionedFigure"/>
-      </w:pPr>
-      <w:r>
-        <w:drawing>
-          <wp:inline>
-            <wp:extent cx="5334000" cy="1917273"/>
-            <wp:effectExtent b="0" l="0" r="0" t="0"/>
-            <wp:docPr descr="Figure 3. Confusion matrices for the three classifiers on the test set (n = 114)." title="" id="29" name="Picture"/>
-            <a:graphic>
-              <a:graphicData uri="http://schemas.openxmlformats.org/drawingml/2006/picture">
-                <pic:pic>
-                  <pic:nvPicPr>
-                    <pic:cNvPr descr="figures/confusion_matrices.png" id="30" name="Picture"/>
-                    <pic:cNvPicPr>
-                      <a:picLocks noChangeArrowheads="1" noChangeAspect="1"/>
-                    </pic:cNvPicPr>
-                  </pic:nvPicPr>
-                  <pic:blipFill>
-                    <a:blip r:embed="rId28"/>
-                    <a:stretch>
-                      <a:fillRect/>
-                    </a:stretch>
-                  </pic:blipFill>
-                  <pic:spPr bwMode="auto">
-                    <a:xfrm>
-                      <a:off x="0" y="0"/>
-                      <a:ext cx="5334000" cy="1917273"/>
-                    </a:xfrm>
-                    <a:prstGeom prst="rect">
-                      <a:avLst/>
-                    </a:prstGeom>
-                    <a:noFill/>
-                    <a:ln w="9525">
-                      <a:noFill/>
-                      <a:headEnd/>
-                      <a:tailEnd/>
-                    </a:ln>
-                  </pic:spPr>
-                </pic:pic>
-              </a:graphicData>
-            </a:graphic>
-          </wp:inline>
-        </w:drawing>
-      </w:r>
-    </w:p>
-    <w:p>
-      <w:pPr>
-        <w:pStyle w:val="ImageCaption"/>
-      </w:pPr>
-      <w:r>
-        <w:t xml:space="preserve">Figure 3. Confusion matrices for the three classifiers on the test set (n = 114).</w:t>
-      </w:r>
-    </w:p>
-    <w:bookmarkEnd w:id="31"/>
-    <w:bookmarkStart w:id="32" w:name="misclassification-analysis"/>
-    <w:p>
-      <w:pPr>
-        <w:pStyle w:val="Heading3"/>
-      </w:pPr>
-      <w:r>
-        <w:t xml:space="preserve">Misclassification Analysis</w:t>
-      </w:r>
-    </w:p>
-    <w:p>
-      <w:pPr>
-        <w:pStyle w:val="FirstParagraph"/>
-      </w:pPr>
-      <w:r>
-        <w:t xml:space="preserve">The LR and SVM classifiers each misclassified 3 malignant cases as benign (false negatives), while the RF classifier misclassified 4 malignant cases. The LR classifier produced 1 false positive (benign classified as malignant), whereas the RF and SVM classifiers produced no false positives.</w:t>
-      </w:r>
-    </w:p>
-    <w:p>
-      <w:pPr>
-        <w:pStyle w:val="BodyText"/>
-      </w:pPr>
-      <w:r>
-        <w:t xml:space="preserve">Model calibration was not assessed in this study; predicted probabilities were used only for binary classification at the 0.5 threshold. Confidence intervals for sensitivity, specificity, PPV, and NPV were not computed; future analyses should include Wilson score intervals for all proportion-based metrics.</w:t>
-      </w:r>
-    </w:p>
-    <w:bookmarkEnd w:id="32"/>
+        <w:rPr>
+          <w:b/>
+          <w:bCs/>
+        </w:rPr>
+        <w:t xml:space="preserve">Figure 3.</w:t>
+      </w:r>
+      <w:r>
+        <w:t xml:space="preserve"> </w:t>
+      </w:r>
+      <w:r>
+        <w:t xml:space="preserve">Confusion matrices for the three index tests at a 0.5 probability threshold (test set, n = 171).</w:t>
+      </w:r>
+    </w:p>
     <w:bookmarkEnd w:id="33"/>
-    <w:bookmarkStart w:id="34" w:name="discussion"/>
+    <w:bookmarkStart w:id="34" w:name="references"/>
     <w:p>
       <w:pPr>
         <w:pStyle w:val="Heading2"/>
       </w:pPr>
       <w:r>
-        <w:t xml:space="preserve">Discussion</w:t>
-      </w:r>
-    </w:p>
-    <w:p>
-      <w:pPr>
-        <w:pStyle w:val="FirstParagraph"/>
-      </w:pPr>
-      <w:r>
-        <w:t xml:space="preserve">All three machine learning classifiers achieved high diagnostic accuracy for FNA-based breast cancer classification, with AUC values exceeding 0.99 and overall accuracies ranging from 0.965 to 0.974. The three models showed comparable discriminative performance, with no statistically significant differences in AUC on pairwise comparison.</w:t>
-      </w:r>
-    </w:p>
-    <w:p>
-      <w:pPr>
-        <w:pStyle w:val="BodyText"/>
-      </w:pPr>
-      <w:r>
-        <w:t xml:space="preserve">These findings are consistent with prior machine learning studies using the Wisconsin Breast Cancer dataset. Wolberg et al. reported classification accuracies exceeding 96% using multisurface pattern separation methods on this dataset [UNVERIFIED - NEEDS MANUAL CHECK]. Street et al. demonstrated that nuclear morphometric features extracted from FNA images contain sufficient information for accurate malignant-benign discrimination [UNVERIFIED - NEEDS MANUAL CHECK]. The uniformly high performance across different classifier architectures in the present study suggests that the separability of classes in the 30-dimensional feature space is the primary determinant of accuracy, rather than the specific choice of algorithm.</w:t>
-      </w:r>
-    </w:p>
-    <w:p>
-      <w:pPr>
-        <w:pStyle w:val="BodyText"/>
-      </w:pPr>
-      <w:r>
-        <w:t xml:space="preserve">The clinical relevance of these results lies in the potential for computer-aided diagnosis to standardize FNA cytological interpretation. Interobserver variability in cytological assessment has been well documented, with reported discordance rates varying from 5% to 25% depending on lesion characteristics and pathologist experience. Automated classification systems trained on quantitative morphometric features could serve as a second reader or triage tool, flagging cases that warrant additional pathologic review and potentially reducing the rate of false-negative diagnoses.</w:t>
-      </w:r>
-    </w:p>
-    <w:p>
-      <w:pPr>
-        <w:pStyle w:val="BodyText"/>
-      </w:pPr>
-      <w:r>
-        <w:t xml:space="preserve">The SVM and RF classifiers both achieved perfect specificity on the test set, resulting in no false-positive diagnoses. This is a desirable property in a screening support tool, as false positives lead to unnecessary biopsies and patient anxiety. However, the sensitivity of all three models remained below 1.000, with 3 to 4 false-negative cases in each classifier. In a clinical setting, false-negative results carry greater consequence, potentially delaying diagnosis and treatment. Further evaluation on larger, independent datasets would help determine whether this sensitivity ceiling is a property of the feature set, the dataset size, or the classifier architectures.</w:t>
-      </w:r>
-    </w:p>
-    <w:p>
-      <w:pPr>
-        <w:pStyle w:val="BodyText"/>
-      </w:pPr>
-      <w:r>
-        <w:t xml:space="preserve">Model calibration was not formally assessed in this study, which limits the clinical utility of predicted probabilities. Future work should include calibration plots and Brier scores to evaluate reliability of probability estimates. The primary limitation is the use of a single-institution dataset without external validation. The random train-test split within a single institution provides only internal validity; prospective or multi-institutional validation is needed before clinical deployment. Second, the clinical variables available in the dataset were limited to age and sex, precluding evaluation of how additional clinical information (e.g., imaging findings, family history) might improve classification performance. Third, the use of a public benchmark dataset with pre-extracted features does not fully replicate the end-to-end clinical workflow, which would include FNA sample preparation, image acquisition, and feature extraction steps, each of which introduces additional sources of variability.</w:t>
-      </w:r>
-    </w:p>
-    <w:p>
-      <w:pPr>
-        <w:pStyle w:val="BodyText"/>
-      </w:pPr>
-      <w:r>
-        <w:t xml:space="preserve">In summary, all three machine learning classifiers demonstrated high diagnostic accuracy for FNA-based breast cancer classification, supporting the feasibility of automated cytological analysis as a computer-aided diagnostic tool. External validation on independent, multi-institutional datasets is warranted before clinical implementation.</w:t>
-      </w:r>
-    </w:p>
-    <w:bookmarkEnd w:id="34"/>
-    <w:bookmarkStart w:id="35" w:name="acknowledgments"/>
-    <w:p>
-      <w:pPr>
-        <w:pStyle w:val="Heading2"/>
-      </w:pPr>
-      <w:r>
-        <w:t xml:space="preserve">Acknowledgments</w:t>
-      </w:r>
-    </w:p>
-    <w:p>
-      <w:pPr>
-        <w:pStyle w:val="FirstParagraph"/>
-      </w:pPr>
-      <w:r>
-        <w:t xml:space="preserve">The authors acknowledge the use of Claude (Anthropic) for writing assistance in preparing this manuscript. The authors retain full responsibility for the content.</w:t>
-      </w:r>
-    </w:p>
-    <w:bookmarkEnd w:id="35"/>
-    <w:bookmarkStart w:id="36" w:name="references"/>
-    <w:p>
-      <w:pPr>
-        <w:pStyle w:val="Heading2"/>
-      </w:pPr>
-      <w:r>
         <w:t xml:space="preserve">References</w:t>
+      </w:r>
+    </w:p>
+    <w:p>
+      <w:pPr>
+        <w:pStyle w:val="BlockText"/>
+      </w:pPr>
+      <w:r>
+        <w:t xml:space="preserve">Note: the references below are UNVERIFIED placeholders. This manuscript is a</w:t>
+      </w:r>
+      <w:r>
+        <w:t xml:space="preserve"> </w:t>
+      </w:r>
+      <w:r>
+        <w:t xml:space="preserve">reproducibility demonstration of the medsci-skills v3.7.0 pipeline, not a clinical</w:t>
+      </w:r>
+      <w:r>
+        <w:t xml:space="preserve"> </w:t>
+      </w:r>
+      <w:r>
+        <w:t xml:space="preserve">submission. In a real submission these markers would be resolved through</w:t>
+      </w:r>
+      <w:r>
+        <w:t xml:space="preserve"> </w:t>
+      </w:r>
+      <w:r>
+        <w:t xml:space="preserve">/search-lit → /lit-sync → /verify-refs and would not be hand-typed.</w:t>
       </w:r>
     </w:p>
     <w:p>
@@ -1209,11 +735,11 @@
         <w:pStyle w:val="Compact"/>
         <w:numPr>
           <w:ilvl w:val="0"/>
-          <w:numId w:val="1001"/>
+          <w:numId w:val="1002"/>
         </w:numPr>
       </w:pPr>
       <w:r>
-        <w:t xml:space="preserve">Sung H, Ferlay J, Siegel RL, et al. Global cancer statistics 2020: GLOBOCAN estimates of incidence and mortality worldwide for 36 cancers in 185 countries. CA Cancer J Clin. 2021;71(3):209-249. [UNVERIFIED - NEEDS MANUAL CHECK]</w:t>
+        <w:t xml:space="preserve">[UNVERIFIED] Reference on fine-needle aspiration of breast masses.</w:t>
       </w:r>
     </w:p>
     <w:p>
@@ -1221,11 +747,11 @@
         <w:pStyle w:val="Compact"/>
         <w:numPr>
           <w:ilvl w:val="0"/>
-          <w:numId w:val="1001"/>
+          <w:numId w:val="1002"/>
         </w:numPr>
       </w:pPr>
       <w:r>
-        <w:t xml:space="preserve">Wolberg WH, Street WN, Mangasarian OL. Machine learning techniques to diagnose breast cancer from fine-needle aspirates. Cancer Lett. 1995;77(2-3):163-171. [UNVERIFIED - NEEDS MANUAL CHECK]</w:t>
+        <w:t xml:space="preserve">[UNVERIFIED] Reference on quantitative cytomorphometry for breast lesion classification.</w:t>
       </w:r>
     </w:p>
     <w:p>
@@ -1233,11 +759,11 @@
         <w:pStyle w:val="Compact"/>
         <w:numPr>
           <w:ilvl w:val="0"/>
-          <w:numId w:val="1001"/>
+          <w:numId w:val="1002"/>
         </w:numPr>
       </w:pPr>
       <w:r>
-        <w:t xml:space="preserve">Street WN, Wolberg WH, Mangasarian OL. Nuclear feature extraction for breast tumor diagnosis. Proc SPIE. 1993;1905:861-870. [UNVERIFIED - NEEDS MANUAL CHECK]</w:t>
+        <w:t xml:space="preserve">[UNVERIFIED] Reference on comparative performance of linear versus ensemble/kernel classifiers on tabular data.</w:t>
       </w:r>
     </w:p>
     <w:p>
@@ -1245,51 +771,111 @@
         <w:pStyle w:val="Compact"/>
         <w:numPr>
           <w:ilvl w:val="0"/>
-          <w:numId w:val="1001"/>
+          <w:numId w:val="1002"/>
         </w:numPr>
       </w:pPr>
       <w:r>
-        <w:t xml:space="preserve">Pedregosa F, Varoquaux G, Gramfort A, et al. Scikit-learn: machine learning in Python. J Mach Learn Res. 2011;12:2825-2830. [UNVERIFIED - NEEDS MANUAL CHECK]</w:t>
-      </w:r>
-    </w:p>
-    <w:bookmarkEnd w:id="36"/>
-    <w:bookmarkStart w:id="37" w:name="funding"/>
-    <w:p>
-      <w:pPr>
-        <w:pStyle w:val="Heading2"/>
-      </w:pPr>
-      <w:r>
-        <w:t xml:space="preserve">Funding</w:t>
-      </w:r>
-    </w:p>
-    <w:p>
-      <w:pPr>
-        <w:pStyle w:val="FirstParagraph"/>
-      </w:pPr>
-      <w:r>
-        <w:t xml:space="preserve">This study received no specific funding.</w:t>
-      </w:r>
-    </w:p>
-    <w:bookmarkEnd w:id="37"/>
-    <w:bookmarkStart w:id="38" w:name="data-availability-statement"/>
-    <w:p>
-      <w:pPr>
-        <w:pStyle w:val="Heading2"/>
-      </w:pPr>
-      <w:r>
-        <w:t xml:space="preserve">Data Availability Statement</w:t>
-      </w:r>
-    </w:p>
-    <w:p>
-      <w:pPr>
-        <w:pStyle w:val="FirstParagraph"/>
-      </w:pPr>
-      <w:r>
-        <w:t xml:space="preserve">The Wisconsin Breast Cancer dataset is publicly available through the UCI Machine Learning Repository (https://archive.ics.uci.edu/ml/datasets/Breast+Cancer+Wisconsin+(Diagnostic)) and the scikit-learn Python package.</w:t>
-      </w:r>
-    </w:p>
-    <w:bookmarkEnd w:id="38"/>
-    <w:bookmarkEnd w:id="39"/>
+        <w:t xml:space="preserve">[UNVERIFIED] Bossuyt PM, et al. STARD 2015 statement for reporting diagnostic accuracy studies.</w:t>
+      </w:r>
+    </w:p>
+    <w:p>
+      <w:pPr>
+        <w:pStyle w:val="Compact"/>
+        <w:numPr>
+          <w:ilvl w:val="0"/>
+          <w:numId w:val="1002"/>
+        </w:numPr>
+      </w:pPr>
+      <w:r>
+        <w:t xml:space="preserve">[UNVERIFIED] DeLong ER, et al. Comparing the areas under two or more correlated ROC curves.</w:t>
+      </w:r>
+    </w:p>
+    <w:p>
+      <w:pPr>
+        <w:pStyle w:val="Compact"/>
+        <w:numPr>
+          <w:ilvl w:val="0"/>
+          <w:numId w:val="1002"/>
+        </w:numPr>
+      </w:pPr>
+      <w:r>
+        <w:t xml:space="preserve">[UNVERIFIED] Pedregosa F, et al. scikit-learn: machine learning in Python.</w:t>
+      </w:r>
+    </w:p>
+    <w:p>
+      <w:pPr>
+        <w:pStyle w:val="Compact"/>
+        <w:numPr>
+          <w:ilvl w:val="0"/>
+          <w:numId w:val="1002"/>
+        </w:numPr>
+      </w:pPr>
+      <w:r>
+        <w:t xml:space="preserve">[UNVERIFIED] Reference on logistic regression for classification.</w:t>
+      </w:r>
+    </w:p>
+    <w:p>
+      <w:pPr>
+        <w:pStyle w:val="Compact"/>
+        <w:numPr>
+          <w:ilvl w:val="0"/>
+          <w:numId w:val="1002"/>
+        </w:numPr>
+      </w:pPr>
+      <w:r>
+        <w:t xml:space="preserve">[UNVERIFIED] Breiman L. Random forests.</w:t>
+      </w:r>
+    </w:p>
+    <w:p>
+      <w:pPr>
+        <w:pStyle w:val="Compact"/>
+        <w:numPr>
+          <w:ilvl w:val="0"/>
+          <w:numId w:val="1002"/>
+        </w:numPr>
+      </w:pPr>
+      <w:r>
+        <w:t xml:space="preserve">[UNVERIFIED] Cortes C, Vapnik V. Support-vector networks.</w:t>
+      </w:r>
+    </w:p>
+    <w:p>
+      <w:pPr>
+        <w:pStyle w:val="Compact"/>
+        <w:numPr>
+          <w:ilvl w:val="0"/>
+          <w:numId w:val="1002"/>
+        </w:numPr>
+      </w:pPr>
+      <w:r>
+        <w:t xml:space="preserve">[UNVERIFIED] Wilson EB. Probable inference, the law of succession, and statistical inference.</w:t>
+      </w:r>
+    </w:p>
+    <w:p>
+      <w:pPr>
+        <w:pStyle w:val="Compact"/>
+        <w:numPr>
+          <w:ilvl w:val="0"/>
+          <w:numId w:val="1002"/>
+        </w:numPr>
+      </w:pPr>
+      <w:r>
+        <w:t xml:space="preserve">[UNVERIFIED] Brier GW. Verification of forecasts expressed in terms of probability.</w:t>
+      </w:r>
+    </w:p>
+    <w:p>
+      <w:pPr>
+        <w:pStyle w:val="Compact"/>
+        <w:numPr>
+          <w:ilvl w:val="0"/>
+          <w:numId w:val="1002"/>
+        </w:numPr>
+      </w:pPr>
+      <w:r>
+        <w:t xml:space="preserve">[UNVERIFIED] Virtanen P, et al. SciPy 1.0: fundamental algorithms for scientific computing in Python.</w:t>
+      </w:r>
+    </w:p>
+    <w:bookmarkEnd w:id="34"/>
+    <w:bookmarkEnd w:id="35"/>
     <w:sectPr>
       <w:footnotePr>
         <w:numRestart w:val="eachSect"/>
@@ -1400,6 +986,109 @@
       </w:pPr>
     </w:lvl>
   </w:abstractNum>
+  <w:abstractNum w:abstractNumId="991">
+    <w:nsid w:val="0000A991"/>
+    <w:multiLevelType w:val="multilevel"/>
+    <w:lvl w:ilvl="0">
+      <w:numFmt w:val="bullet"/>
+      <w:lvlText w:val=""/>
+      <w:lvlJc w:val="left"/>
+      <w:pPr>
+        <w:ind w:left="720" w:hanging="360"/>
+      </w:pPr>
+      <w:rPr>
+        <w:rFonts w:ascii="Symbol" w:hAnsi="Symbol" w:cs="Symbol" w:hint="default"/>
+      </w:rPr>
+    </w:lvl>
+    <w:lvl w:ilvl="1">
+      <w:numFmt w:val="bullet"/>
+      <w:lvlText w:val="o"/>
+      <w:lvlJc w:val="left"/>
+      <w:pPr>
+        <w:ind w:left="1440" w:hanging="360"/>
+      </w:pPr>
+      <w:rPr>
+        <w:rFonts w:ascii="Courier New" w:hAnsi="Courier New" w:cs="Courier New" w:hint="default"/>
+      </w:rPr>
+    </w:lvl>
+    <w:lvl w:ilvl="2">
+      <w:numFmt w:val="bullet"/>
+      <w:lvlText w:val=""/>
+      <w:lvlJc w:val="left"/>
+      <w:pPr>
+        <w:ind w:left="2160" w:hanging="360"/>
+      </w:pPr>
+      <w:rPr>
+        <w:rFonts w:ascii="Wingdings" w:hAnsi="Wingdings" w:cs="Wingdings" w:hint="default"/>
+      </w:rPr>
+    </w:lvl>
+    <w:lvl w:ilvl="3">
+      <w:numFmt w:val="bullet"/>
+      <w:lvlText w:val=""/>
+      <w:lvlJc w:val="left"/>
+      <w:pPr>
+        <w:ind w:left="2880" w:hanging="360"/>
+      </w:pPr>
+      <w:rPr>
+        <w:rFonts w:ascii="Symbol" w:hAnsi="Symbol" w:cs="Symbol" w:hint="default"/>
+      </w:rPr>
+    </w:lvl>
+    <w:lvl w:ilvl="4">
+      <w:numFmt w:val="bullet"/>
+      <w:lvlText w:val="o"/>
+      <w:lvlJc w:val="left"/>
+      <w:pPr>
+        <w:ind w:left="3600" w:hanging="360"/>
+      </w:pPr>
+      <w:rPr>
+        <w:rFonts w:ascii="Courier New" w:hAnsi="Courier New" w:cs="Courier New" w:hint="default"/>
+      </w:rPr>
+    </w:lvl>
+    <w:lvl w:ilvl="5">
+      <w:numFmt w:val="bullet"/>
+      <w:lvlText w:val=""/>
+      <w:lvlJc w:val="left"/>
+      <w:pPr>
+        <w:ind w:left="4320" w:hanging="360"/>
+      </w:pPr>
+      <w:rPr>
+        <w:rFonts w:ascii="Wingdings" w:hAnsi="Wingdings" w:cs="Wingdings" w:hint="default"/>
+      </w:rPr>
+    </w:lvl>
+    <w:lvl w:ilvl="6">
+      <w:numFmt w:val="bullet"/>
+      <w:lvlText w:val=""/>
+      <w:lvlJc w:val="left"/>
+      <w:pPr>
+        <w:ind w:left="5040" w:hanging="360"/>
+      </w:pPr>
+      <w:rPr>
+        <w:rFonts w:ascii="Symbol" w:hAnsi="Symbol" w:cs="Symbol" w:hint="default"/>
+      </w:rPr>
+    </w:lvl>
+    <w:lvl w:ilvl="7">
+      <w:numFmt w:val="bullet"/>
+      <w:lvlText w:val="o"/>
+      <w:lvlJc w:val="left"/>
+      <w:pPr>
+        <w:ind w:left="5760" w:hanging="360"/>
+      </w:pPr>
+      <w:rPr>
+        <w:rFonts w:ascii="Courier New" w:hAnsi="Courier New" w:cs="Courier New" w:hint="default"/>
+      </w:rPr>
+    </w:lvl>
+    <w:lvl w:ilvl="8">
+      <w:numFmt w:val="bullet"/>
+      <w:lvlText w:val=""/>
+      <w:lvlJc w:val="left"/>
+      <w:pPr>
+        <w:ind w:left="6480" w:hanging="360"/>
+      </w:pPr>
+      <w:rPr>
+        <w:rFonts w:ascii="Wingdings" w:hAnsi="Wingdings" w:cs="Wingdings" w:hint="default"/>
+      </w:rPr>
+    </w:lvl>
+  </w:abstractNum>
   <w:abstractNum w:abstractNumId="99411">
     <w:nsid w:val="00A99411"/>
     <w:multiLevelType w:val="multilevel"/>
@@ -1489,6 +1178,9 @@
     <w:abstractNumId w:val="990"/>
   </w:num>
   <w:num w:numId="1001">
+    <w:abstractNumId w:val="991"/>
+  </w:num>
+  <w:num w:numId="1002">
     <w:abstractNumId w:val="99411"/>
     <w:lvlOverride w:ilvl="0">
       <w:startOverride w:val="1"/>

</xml_diff>